<commit_message>
wk 2 overview update and team contract
</commit_message>
<xml_diff>
--- a/Labs/Lab5/CS246_TeamContract.docx
+++ b/Labs/Lab5/CS246_TeamContract.docx
@@ -1,6 +1,6 @@
 
 <file path=word/document.xml><?xml version="1.0" encoding="utf-8"?>
-<w:document xmlns:wpc="http://schemas.microsoft.com/office/word/2010/wordprocessingCanvas" xmlns:cx="http://schemas.microsoft.com/office/drawing/2014/chartex" xmlns:cx1="http://schemas.microsoft.com/office/drawing/2015/9/8/chartex" xmlns:cx2="http://schemas.microsoft.com/office/drawing/2015/10/21/chartex" xmlns:cx3="http://schemas.microsoft.com/office/drawing/2016/5/9/chartex" xmlns:cx4="http://schemas.microsoft.com/office/drawing/2016/5/10/chartex" xmlns:cx5="http://schemas.microsoft.com/office/drawing/2016/5/11/chartex" xmlns:cx6="http://schemas.microsoft.com/office/drawing/2016/5/12/chartex" xmlns:cx7="http://schemas.microsoft.com/office/drawing/2016/5/13/chartex" xmlns:cx8="http://schemas.microsoft.com/office/drawing/2016/5/14/chartex" xmlns:mc="http://schemas.openxmlformats.org/markup-compatibility/2006" xmlns:aink="http://schemas.microsoft.com/office/drawing/2016/ink" xmlns:am3d="http://schemas.microsoft.com/office/drawing/2017/model3d" xmlns:o="urn:schemas-microsoft-com:office:office" xmlns:oel="http://schemas.microsoft.com/office/2019/extlst" xmlns:r="http://schemas.openxmlformats.org/officeDocument/2006/relationships" xmlns:m="http://schemas.openxmlformats.org/officeDocument/2006/math" xmlns:v="urn:schemas-microsoft-com:vml" xmlns:wp14="http://schemas.microsoft.com/office/word/2010/wordprocessingDrawing" xmlns:wp="http://schemas.openxmlformats.org/drawingml/2006/wordprocessingDrawing" xmlns:w10="urn:schemas-microsoft-com:office:word" xmlns:w="http://schemas.openxmlformats.org/wordprocessingml/2006/main" xmlns:w14="http://schemas.microsoft.com/office/word/2010/wordml" xmlns:w15="http://schemas.microsoft.com/office/word/2012/wordml" xmlns:w16cex="http://schemas.microsoft.com/office/word/2018/wordml/cex" xmlns:w16cid="http://schemas.microsoft.com/office/word/2016/wordml/cid" xmlns:w16="http://schemas.microsoft.com/office/word/2018/wordml" xmlns:w16du="http://schemas.microsoft.com/office/word/2023/wordml/word16du" xmlns:w16sdtdh="http://schemas.microsoft.com/office/word/2020/wordml/sdtdatahash" xmlns:w16sdtfl="http://schemas.microsoft.com/office/word/2024/wordml/sdtformatlock" xmlns:w16se="http://schemas.microsoft.com/office/word/2015/wordml/symex" xmlns:wpg="http://schemas.microsoft.com/office/word/2010/wordprocessingGroup" xmlns:wpi="http://schemas.microsoft.com/office/word/2010/wordprocessingInk" xmlns:wne="http://schemas.microsoft.com/office/word/2006/wordml" xmlns:wps="http://schemas.microsoft.com/office/word/2010/wordprocessingShape" mc:Ignorable="w14 w15 w16se w16cid w16 w16cex w16sdtdh w16sdtfl w16du wp14">
+<w:document xmlns:wpc="http://schemas.microsoft.com/office/word/2010/wordprocessingCanvas" xmlns:cx="http://schemas.microsoft.com/office/drawing/2014/chartex" xmlns:cx1="http://schemas.microsoft.com/office/drawing/2015/9/8/chartex" xmlns:cx2="http://schemas.microsoft.com/office/drawing/2015/10/21/chartex" xmlns:cx3="http://schemas.microsoft.com/office/drawing/2016/5/9/chartex" xmlns:cx4="http://schemas.microsoft.com/office/drawing/2016/5/10/chartex" xmlns:cx5="http://schemas.microsoft.com/office/drawing/2016/5/11/chartex" xmlns:cx6="http://schemas.microsoft.com/office/drawing/2016/5/12/chartex" xmlns:cx7="http://schemas.microsoft.com/office/drawing/2016/5/13/chartex" xmlns:cx8="http://schemas.microsoft.com/office/drawing/2016/5/14/chartex" xmlns:mc="http://schemas.openxmlformats.org/markup-compatibility/2006" xmlns:aink="http://schemas.microsoft.com/office/drawing/2016/ink" xmlns:am3d="http://schemas.microsoft.com/office/drawing/2017/model3d" xmlns:o="urn:schemas-microsoft-com:office:office" xmlns:oel="http://schemas.microsoft.com/office/2019/extlst" xmlns:r="http://schemas.openxmlformats.org/officeDocument/2006/relationships" xmlns:m="http://schemas.openxmlformats.org/officeDocument/2006/math" xmlns:v="urn:schemas-microsoft-com:vml" xmlns:wp14="http://schemas.microsoft.com/office/word/2010/wordprocessingDrawing" xmlns:wp="http://schemas.openxmlformats.org/drawingml/2006/wordprocessingDrawing" xmlns:w10="urn:schemas-microsoft-com:office:word" xmlns:w="http://schemas.openxmlformats.org/wordprocessingml/2006/main" xmlns:w14="http://schemas.microsoft.com/office/word/2010/wordml" xmlns:w15="http://schemas.microsoft.com/office/word/2012/wordml" xmlns:w16cex="http://schemas.microsoft.com/office/word/2018/wordml/cex" xmlns:w16cid="http://schemas.microsoft.com/office/word/2016/wordml/cid" xmlns:w16="http://schemas.microsoft.com/office/word/2018/wordml" xmlns:w16sdtdh="http://schemas.microsoft.com/office/word/2020/wordml/sdtdatahash" xmlns:w16se="http://schemas.microsoft.com/office/word/2015/wordml/symex" xmlns:wpg="http://schemas.microsoft.com/office/word/2010/wordprocessingGroup" xmlns:wpi="http://schemas.microsoft.com/office/word/2010/wordprocessingInk" xmlns:wne="http://schemas.microsoft.com/office/word/2006/wordml" xmlns:wps="http://schemas.microsoft.com/office/word/2010/wordprocessingShape" mc:Ignorable="w14 w15 w16se w16cid w16 w16cex w16sdtdh wp14">
   <w:body>
     <w:p>
       <w:pPr>
@@ -215,15 +215,7 @@
         <w:t>Discord</w:t>
       </w:r>
       <w:r>
-        <w:t xml:space="preserve">, face-to-face, in class) </w:t>
-      </w:r>
-      <w:proofErr w:type="gramStart"/>
-      <w:r>
-        <w:t>in order to</w:t>
-      </w:r>
-      <w:proofErr w:type="gramEnd"/>
-      <w:r>
-        <w:t xml:space="preserve"> inform each other of team meetings, announcement, updates, reminders, problems:</w:t>
+        <w:t>, face-to-face, in class) in order to inform each other of team meetings, announcement, updates, reminders, problems:</w:t>
       </w:r>
     </w:p>
     <w:p>
@@ -569,7 +561,13 @@
         <w:t xml:space="preserve"> ensure cooperation </w:t>
       </w:r>
       <w:r>
-        <w:t>and equal distribution of tasks?</w:t>
+        <w:t>and equal distribution of tasks</w:t>
+      </w:r>
+      <w:r>
+        <w:t xml:space="preserve"> for your project</w:t>
+      </w:r>
+      <w:r>
+        <w:t>?</w:t>
       </w:r>
     </w:p>
     <w:p>
@@ -627,7 +625,13 @@
         <w:ind w:left="360"/>
       </w:pPr>
       <w:r>
-        <w:t>What will you do to make sure that all team members are participating in decision making?</w:t>
+        <w:t>What will you do to make sure that all team members are participating in decision making</w:t>
+      </w:r>
+      <w:r>
+        <w:t xml:space="preserve"> in meetings or online discussions</w:t>
+      </w:r>
+      <w:r>
+        <w:t>?</w:t>
       </w:r>
     </w:p>
     <w:p>
@@ -678,7 +682,19 @@
         <w:ind w:left="360"/>
       </w:pPr>
       <w:r>
-        <w:t>Strategies for keeping on task (task maintenance):</w:t>
+        <w:t>Strategies for keeping on task (</w:t>
+      </w:r>
+      <w:r>
+        <w:t>getting tasks done</w:t>
+      </w:r>
+      <w:r>
+        <w:t>)</w:t>
+      </w:r>
+      <w:r>
+        <w:t xml:space="preserve"> when working</w:t>
+      </w:r>
+      <w:r>
+        <w:t>:</w:t>
       </w:r>
     </w:p>
     <w:p>
@@ -916,7 +932,6 @@
     </w:p>
     <w:p>
       <w:r>
-        <w:lastRenderedPageBreak/>
         <w:t>***************************************************************************</w:t>
       </w:r>
     </w:p>
@@ -1192,7 +1207,13 @@
         <w:ind w:left="0" w:firstLine="0"/>
       </w:pPr>
       <w:r>
-        <w:t>This document was provided by Paul Wilkins in 2018, Revised by Brian Bird in 2025.</w:t>
+        <w:t>This document was provided by Paul Wilkins in 2018, Revised by Brian Bird in 202</w:t>
+      </w:r>
+      <w:r>
+        <w:t>6</w:t>
+      </w:r>
+      <w:r>
+        <w:t>.</w:t>
       </w:r>
     </w:p>
     <w:sectPr>
@@ -1206,7 +1227,7 @@
 </file>
 
 <file path=word/endnotes.xml><?xml version="1.0" encoding="utf-8"?>
-<w:endnotes xmlns:wpc="http://schemas.microsoft.com/office/word/2010/wordprocessingCanvas" xmlns:cx="http://schemas.microsoft.com/office/drawing/2014/chartex" xmlns:cx1="http://schemas.microsoft.com/office/drawing/2015/9/8/chartex" xmlns:cx2="http://schemas.microsoft.com/office/drawing/2015/10/21/chartex" xmlns:cx3="http://schemas.microsoft.com/office/drawing/2016/5/9/chartex" xmlns:cx4="http://schemas.microsoft.com/office/drawing/2016/5/10/chartex" xmlns:cx5="http://schemas.microsoft.com/office/drawing/2016/5/11/chartex" xmlns:cx6="http://schemas.microsoft.com/office/drawing/2016/5/12/chartex" xmlns:cx7="http://schemas.microsoft.com/office/drawing/2016/5/13/chartex" xmlns:cx8="http://schemas.microsoft.com/office/drawing/2016/5/14/chartex" xmlns:mc="http://schemas.openxmlformats.org/markup-compatibility/2006" xmlns:aink="http://schemas.microsoft.com/office/drawing/2016/ink" xmlns:am3d="http://schemas.microsoft.com/office/drawing/2017/model3d" xmlns:o="urn:schemas-microsoft-com:office:office" xmlns:oel="http://schemas.microsoft.com/office/2019/extlst" xmlns:r="http://schemas.openxmlformats.org/officeDocument/2006/relationships" xmlns:m="http://schemas.openxmlformats.org/officeDocument/2006/math" xmlns:v="urn:schemas-microsoft-com:vml" xmlns:wp14="http://schemas.microsoft.com/office/word/2010/wordprocessingDrawing" xmlns:wp="http://schemas.openxmlformats.org/drawingml/2006/wordprocessingDrawing" xmlns:w10="urn:schemas-microsoft-com:office:word" xmlns:w="http://schemas.openxmlformats.org/wordprocessingml/2006/main" xmlns:w14="http://schemas.microsoft.com/office/word/2010/wordml" xmlns:w15="http://schemas.microsoft.com/office/word/2012/wordml" xmlns:w16cex="http://schemas.microsoft.com/office/word/2018/wordml/cex" xmlns:w16cid="http://schemas.microsoft.com/office/word/2016/wordml/cid" xmlns:w16="http://schemas.microsoft.com/office/word/2018/wordml" xmlns:w16du="http://schemas.microsoft.com/office/word/2023/wordml/word16du" xmlns:w16sdtdh="http://schemas.microsoft.com/office/word/2020/wordml/sdtdatahash" xmlns:w16sdtfl="http://schemas.microsoft.com/office/word/2024/wordml/sdtformatlock" xmlns:w16se="http://schemas.microsoft.com/office/word/2015/wordml/symex" xmlns:wpg="http://schemas.microsoft.com/office/word/2010/wordprocessingGroup" xmlns:wpi="http://schemas.microsoft.com/office/word/2010/wordprocessingInk" xmlns:wne="http://schemas.microsoft.com/office/word/2006/wordml" xmlns:wps="http://schemas.microsoft.com/office/word/2010/wordprocessingShape" mc:Ignorable="w14 w15 w16se w16cid w16 w16cex w16sdtdh w16sdtfl w16du wp14">
+<w:endnotes xmlns:wpc="http://schemas.microsoft.com/office/word/2010/wordprocessingCanvas" xmlns:cx="http://schemas.microsoft.com/office/drawing/2014/chartex" xmlns:cx1="http://schemas.microsoft.com/office/drawing/2015/9/8/chartex" xmlns:cx2="http://schemas.microsoft.com/office/drawing/2015/10/21/chartex" xmlns:cx3="http://schemas.microsoft.com/office/drawing/2016/5/9/chartex" xmlns:cx4="http://schemas.microsoft.com/office/drawing/2016/5/10/chartex" xmlns:cx5="http://schemas.microsoft.com/office/drawing/2016/5/11/chartex" xmlns:cx6="http://schemas.microsoft.com/office/drawing/2016/5/12/chartex" xmlns:cx7="http://schemas.microsoft.com/office/drawing/2016/5/13/chartex" xmlns:cx8="http://schemas.microsoft.com/office/drawing/2016/5/14/chartex" xmlns:mc="http://schemas.openxmlformats.org/markup-compatibility/2006" xmlns:aink="http://schemas.microsoft.com/office/drawing/2016/ink" xmlns:am3d="http://schemas.microsoft.com/office/drawing/2017/model3d" xmlns:o="urn:schemas-microsoft-com:office:office" xmlns:oel="http://schemas.microsoft.com/office/2019/extlst" xmlns:r="http://schemas.openxmlformats.org/officeDocument/2006/relationships" xmlns:m="http://schemas.openxmlformats.org/officeDocument/2006/math" xmlns:v="urn:schemas-microsoft-com:vml" xmlns:wp14="http://schemas.microsoft.com/office/word/2010/wordprocessingDrawing" xmlns:wp="http://schemas.openxmlformats.org/drawingml/2006/wordprocessingDrawing" xmlns:w10="urn:schemas-microsoft-com:office:word" xmlns:w="http://schemas.openxmlformats.org/wordprocessingml/2006/main" xmlns:w14="http://schemas.microsoft.com/office/word/2010/wordml" xmlns:w15="http://schemas.microsoft.com/office/word/2012/wordml" xmlns:w16cex="http://schemas.microsoft.com/office/word/2018/wordml/cex" xmlns:w16cid="http://schemas.microsoft.com/office/word/2016/wordml/cid" xmlns:w16="http://schemas.microsoft.com/office/word/2018/wordml" xmlns:w16sdtdh="http://schemas.microsoft.com/office/word/2020/wordml/sdtdatahash" xmlns:w16se="http://schemas.microsoft.com/office/word/2015/wordml/symex" xmlns:wpg="http://schemas.microsoft.com/office/word/2010/wordprocessingGroup" xmlns:wpi="http://schemas.microsoft.com/office/word/2010/wordprocessingInk" xmlns:wne="http://schemas.microsoft.com/office/word/2006/wordml" xmlns:wps="http://schemas.microsoft.com/office/word/2010/wordprocessingShape" mc:Ignorable="w14 w15 w16se w16cid w16 w16cex w16sdtdh wp14">
   <w:endnote w:type="separator" w:id="-1">
     <w:p>
       <w:r>
@@ -1225,7 +1246,7 @@
 </file>
 
 <file path=word/footnotes.xml><?xml version="1.0" encoding="utf-8"?>
-<w:footnotes xmlns:wpc="http://schemas.microsoft.com/office/word/2010/wordprocessingCanvas" xmlns:cx="http://schemas.microsoft.com/office/drawing/2014/chartex" xmlns:cx1="http://schemas.microsoft.com/office/drawing/2015/9/8/chartex" xmlns:cx2="http://schemas.microsoft.com/office/drawing/2015/10/21/chartex" xmlns:cx3="http://schemas.microsoft.com/office/drawing/2016/5/9/chartex" xmlns:cx4="http://schemas.microsoft.com/office/drawing/2016/5/10/chartex" xmlns:cx5="http://schemas.microsoft.com/office/drawing/2016/5/11/chartex" xmlns:cx6="http://schemas.microsoft.com/office/drawing/2016/5/12/chartex" xmlns:cx7="http://schemas.microsoft.com/office/drawing/2016/5/13/chartex" xmlns:cx8="http://schemas.microsoft.com/office/drawing/2016/5/14/chartex" xmlns:mc="http://schemas.openxmlformats.org/markup-compatibility/2006" xmlns:aink="http://schemas.microsoft.com/office/drawing/2016/ink" xmlns:am3d="http://schemas.microsoft.com/office/drawing/2017/model3d" xmlns:o="urn:schemas-microsoft-com:office:office" xmlns:oel="http://schemas.microsoft.com/office/2019/extlst" xmlns:r="http://schemas.openxmlformats.org/officeDocument/2006/relationships" xmlns:m="http://schemas.openxmlformats.org/officeDocument/2006/math" xmlns:v="urn:schemas-microsoft-com:vml" xmlns:wp14="http://schemas.microsoft.com/office/word/2010/wordprocessingDrawing" xmlns:wp="http://schemas.openxmlformats.org/drawingml/2006/wordprocessingDrawing" xmlns:w10="urn:schemas-microsoft-com:office:word" xmlns:w="http://schemas.openxmlformats.org/wordprocessingml/2006/main" xmlns:w14="http://schemas.microsoft.com/office/word/2010/wordml" xmlns:w15="http://schemas.microsoft.com/office/word/2012/wordml" xmlns:w16cex="http://schemas.microsoft.com/office/word/2018/wordml/cex" xmlns:w16cid="http://schemas.microsoft.com/office/word/2016/wordml/cid" xmlns:w16="http://schemas.microsoft.com/office/word/2018/wordml" xmlns:w16du="http://schemas.microsoft.com/office/word/2023/wordml/word16du" xmlns:w16sdtdh="http://schemas.microsoft.com/office/word/2020/wordml/sdtdatahash" xmlns:w16sdtfl="http://schemas.microsoft.com/office/word/2024/wordml/sdtformatlock" xmlns:w16se="http://schemas.microsoft.com/office/word/2015/wordml/symex" xmlns:wpg="http://schemas.microsoft.com/office/word/2010/wordprocessingGroup" xmlns:wpi="http://schemas.microsoft.com/office/word/2010/wordprocessingInk" xmlns:wne="http://schemas.microsoft.com/office/word/2006/wordml" xmlns:wps="http://schemas.microsoft.com/office/word/2010/wordprocessingShape" mc:Ignorable="w14 w15 w16se w16cid w16 w16cex w16sdtdh w16sdtfl w16du wp14">
+<w:footnotes xmlns:wpc="http://schemas.microsoft.com/office/word/2010/wordprocessingCanvas" xmlns:cx="http://schemas.microsoft.com/office/drawing/2014/chartex" xmlns:cx1="http://schemas.microsoft.com/office/drawing/2015/9/8/chartex" xmlns:cx2="http://schemas.microsoft.com/office/drawing/2015/10/21/chartex" xmlns:cx3="http://schemas.microsoft.com/office/drawing/2016/5/9/chartex" xmlns:cx4="http://schemas.microsoft.com/office/drawing/2016/5/10/chartex" xmlns:cx5="http://schemas.microsoft.com/office/drawing/2016/5/11/chartex" xmlns:cx6="http://schemas.microsoft.com/office/drawing/2016/5/12/chartex" xmlns:cx7="http://schemas.microsoft.com/office/drawing/2016/5/13/chartex" xmlns:cx8="http://schemas.microsoft.com/office/drawing/2016/5/14/chartex" xmlns:mc="http://schemas.openxmlformats.org/markup-compatibility/2006" xmlns:aink="http://schemas.microsoft.com/office/drawing/2016/ink" xmlns:am3d="http://schemas.microsoft.com/office/drawing/2017/model3d" xmlns:o="urn:schemas-microsoft-com:office:office" xmlns:oel="http://schemas.microsoft.com/office/2019/extlst" xmlns:r="http://schemas.openxmlformats.org/officeDocument/2006/relationships" xmlns:m="http://schemas.openxmlformats.org/officeDocument/2006/math" xmlns:v="urn:schemas-microsoft-com:vml" xmlns:wp14="http://schemas.microsoft.com/office/word/2010/wordprocessingDrawing" xmlns:wp="http://schemas.openxmlformats.org/drawingml/2006/wordprocessingDrawing" xmlns:w10="urn:schemas-microsoft-com:office:word" xmlns:w="http://schemas.openxmlformats.org/wordprocessingml/2006/main" xmlns:w14="http://schemas.microsoft.com/office/word/2010/wordml" xmlns:w15="http://schemas.microsoft.com/office/word/2012/wordml" xmlns:w16cex="http://schemas.microsoft.com/office/word/2018/wordml/cex" xmlns:w16cid="http://schemas.microsoft.com/office/word/2016/wordml/cid" xmlns:w16="http://schemas.microsoft.com/office/word/2018/wordml" xmlns:w16sdtdh="http://schemas.microsoft.com/office/word/2020/wordml/sdtdatahash" xmlns:w16se="http://schemas.microsoft.com/office/word/2015/wordml/symex" xmlns:wpg="http://schemas.microsoft.com/office/word/2010/wordprocessingGroup" xmlns:wpi="http://schemas.microsoft.com/office/word/2010/wordprocessingInk" xmlns:wne="http://schemas.microsoft.com/office/word/2006/wordml" xmlns:wps="http://schemas.microsoft.com/office/word/2010/wordprocessingShape" mc:Ignorable="w14 w15 w16se w16cid w16 w16cex w16sdtdh wp14">
   <w:footnote w:type="separator" w:id="-1">
     <w:p>
       <w:r>
@@ -1244,7 +1265,7 @@
 </file>
 
 <file path=word/numbering.xml><?xml version="1.0" encoding="utf-8"?>
-<w:numbering xmlns:wpc="http://schemas.microsoft.com/office/word/2010/wordprocessingCanvas" xmlns:cx="http://schemas.microsoft.com/office/drawing/2014/chartex" xmlns:cx1="http://schemas.microsoft.com/office/drawing/2015/9/8/chartex" xmlns:cx2="http://schemas.microsoft.com/office/drawing/2015/10/21/chartex" xmlns:cx3="http://schemas.microsoft.com/office/drawing/2016/5/9/chartex" xmlns:cx4="http://schemas.microsoft.com/office/drawing/2016/5/10/chartex" xmlns:cx5="http://schemas.microsoft.com/office/drawing/2016/5/11/chartex" xmlns:cx6="http://schemas.microsoft.com/office/drawing/2016/5/12/chartex" xmlns:cx7="http://schemas.microsoft.com/office/drawing/2016/5/13/chartex" xmlns:cx8="http://schemas.microsoft.com/office/drawing/2016/5/14/chartex" xmlns:mc="http://schemas.openxmlformats.org/markup-compatibility/2006" xmlns:aink="http://schemas.microsoft.com/office/drawing/2016/ink" xmlns:am3d="http://schemas.microsoft.com/office/drawing/2017/model3d" xmlns:o="urn:schemas-microsoft-com:office:office" xmlns:oel="http://schemas.microsoft.com/office/2019/extlst" xmlns:r="http://schemas.openxmlformats.org/officeDocument/2006/relationships" xmlns:m="http://schemas.openxmlformats.org/officeDocument/2006/math" xmlns:v="urn:schemas-microsoft-com:vml" xmlns:wp14="http://schemas.microsoft.com/office/word/2010/wordprocessingDrawing" xmlns:wp="http://schemas.openxmlformats.org/drawingml/2006/wordprocessingDrawing" xmlns:w10="urn:schemas-microsoft-com:office:word" xmlns:w="http://schemas.openxmlformats.org/wordprocessingml/2006/main" xmlns:w14="http://schemas.microsoft.com/office/word/2010/wordml" xmlns:w15="http://schemas.microsoft.com/office/word/2012/wordml" xmlns:w16cex="http://schemas.microsoft.com/office/word/2018/wordml/cex" xmlns:w16cid="http://schemas.microsoft.com/office/word/2016/wordml/cid" xmlns:w16="http://schemas.microsoft.com/office/word/2018/wordml" xmlns:w16du="http://schemas.microsoft.com/office/word/2023/wordml/word16du" xmlns:w16sdtdh="http://schemas.microsoft.com/office/word/2020/wordml/sdtdatahash" xmlns:w16sdtfl="http://schemas.microsoft.com/office/word/2024/wordml/sdtformatlock" xmlns:w16se="http://schemas.microsoft.com/office/word/2015/wordml/symex" xmlns:wpg="http://schemas.microsoft.com/office/word/2010/wordprocessingGroup" xmlns:wpi="http://schemas.microsoft.com/office/word/2010/wordprocessingInk" xmlns:wne="http://schemas.microsoft.com/office/word/2006/wordml" xmlns:wps="http://schemas.microsoft.com/office/word/2010/wordprocessingShape" mc:Ignorable="w14 w15 w16se w16cid w16 w16cex w16sdtdh w16sdtfl w16du wp14">
+<w:numbering xmlns:wpc="http://schemas.microsoft.com/office/word/2010/wordprocessingCanvas" xmlns:cx="http://schemas.microsoft.com/office/drawing/2014/chartex" xmlns:cx1="http://schemas.microsoft.com/office/drawing/2015/9/8/chartex" xmlns:cx2="http://schemas.microsoft.com/office/drawing/2015/10/21/chartex" xmlns:cx3="http://schemas.microsoft.com/office/drawing/2016/5/9/chartex" xmlns:cx4="http://schemas.microsoft.com/office/drawing/2016/5/10/chartex" xmlns:cx5="http://schemas.microsoft.com/office/drawing/2016/5/11/chartex" xmlns:cx6="http://schemas.microsoft.com/office/drawing/2016/5/12/chartex" xmlns:cx7="http://schemas.microsoft.com/office/drawing/2016/5/13/chartex" xmlns:cx8="http://schemas.microsoft.com/office/drawing/2016/5/14/chartex" xmlns:mc="http://schemas.openxmlformats.org/markup-compatibility/2006" xmlns:aink="http://schemas.microsoft.com/office/drawing/2016/ink" xmlns:am3d="http://schemas.microsoft.com/office/drawing/2017/model3d" xmlns:o="urn:schemas-microsoft-com:office:office" xmlns:oel="http://schemas.microsoft.com/office/2019/extlst" xmlns:r="http://schemas.openxmlformats.org/officeDocument/2006/relationships" xmlns:m="http://schemas.openxmlformats.org/officeDocument/2006/math" xmlns:v="urn:schemas-microsoft-com:vml" xmlns:wp14="http://schemas.microsoft.com/office/word/2010/wordprocessingDrawing" xmlns:wp="http://schemas.openxmlformats.org/drawingml/2006/wordprocessingDrawing" xmlns:w10="urn:schemas-microsoft-com:office:word" xmlns:w="http://schemas.openxmlformats.org/wordprocessingml/2006/main" xmlns:w14="http://schemas.microsoft.com/office/word/2010/wordml" xmlns:w15="http://schemas.microsoft.com/office/word/2012/wordml" xmlns:w16cex="http://schemas.microsoft.com/office/word/2018/wordml/cex" xmlns:w16cid="http://schemas.microsoft.com/office/word/2016/wordml/cid" xmlns:w16="http://schemas.microsoft.com/office/word/2018/wordml" xmlns:w16sdtdh="http://schemas.microsoft.com/office/word/2020/wordml/sdtdatahash" xmlns:w16se="http://schemas.microsoft.com/office/word/2015/wordml/symex" xmlns:wpg="http://schemas.microsoft.com/office/word/2010/wordprocessingGroup" xmlns:wpi="http://schemas.microsoft.com/office/word/2010/wordprocessingInk" xmlns:wne="http://schemas.microsoft.com/office/word/2006/wordml" xmlns:wps="http://schemas.microsoft.com/office/word/2010/wordprocessingShape" mc:Ignorable="w14 w15 w16se w16cid w16 w16cex w16sdtdh wp14">
   <w:abstractNum w:abstractNumId="0" w15:restartNumberingAfterBreak="0">
     <w:nsid w:val="2A732C98"/>
     <w:multiLevelType w:val="hybridMultilevel"/>
@@ -2123,7 +2144,7 @@
 </file>
 
 <file path=word/styles.xml><?xml version="1.0" encoding="utf-8"?>
-<w:styles xmlns:mc="http://schemas.openxmlformats.org/markup-compatibility/2006" xmlns:r="http://schemas.openxmlformats.org/officeDocument/2006/relationships" xmlns:w="http://schemas.openxmlformats.org/wordprocessingml/2006/main" xmlns:w14="http://schemas.microsoft.com/office/word/2010/wordml" xmlns:w15="http://schemas.microsoft.com/office/word/2012/wordml" xmlns:w16cex="http://schemas.microsoft.com/office/word/2018/wordml/cex" xmlns:w16cid="http://schemas.microsoft.com/office/word/2016/wordml/cid" xmlns:w16="http://schemas.microsoft.com/office/word/2018/wordml" xmlns:w16du="http://schemas.microsoft.com/office/word/2023/wordml/word16du" xmlns:w16sdtdh="http://schemas.microsoft.com/office/word/2020/wordml/sdtdatahash" xmlns:w16sdtfl="http://schemas.microsoft.com/office/word/2024/wordml/sdtformatlock" xmlns:w16se="http://schemas.microsoft.com/office/word/2015/wordml/symex" mc:Ignorable="w14 w15 w16se w16cid w16 w16cex w16sdtdh w16sdtfl w16du">
+<w:styles xmlns:mc="http://schemas.openxmlformats.org/markup-compatibility/2006" xmlns:r="http://schemas.openxmlformats.org/officeDocument/2006/relationships" xmlns:w="http://schemas.openxmlformats.org/wordprocessingml/2006/main" xmlns:w14="http://schemas.microsoft.com/office/word/2010/wordml" xmlns:w15="http://schemas.microsoft.com/office/word/2012/wordml" xmlns:w16cex="http://schemas.microsoft.com/office/word/2018/wordml/cex" xmlns:w16cid="http://schemas.microsoft.com/office/word/2016/wordml/cid" xmlns:w16="http://schemas.microsoft.com/office/word/2018/wordml" xmlns:w16sdtdh="http://schemas.microsoft.com/office/word/2020/wordml/sdtdatahash" xmlns:w16se="http://schemas.microsoft.com/office/word/2015/wordml/symex" mc:Ignorable="w14 w15 w16se w16cid w16 w16cex w16sdtdh">
   <w:docDefaults>
     <w:rPrDefault>
       <w:rPr>

</xml_diff>